<commit_message>
Make contract self-contained: drop appendix, embed per-phase outputs
Remove all references to the attached proposal and instead spell out each
phase's activities and concrete deliverables/results directly in Article 4,
with delivery of those results made the acceptance condition. Applied to
both the Word build and the HTML version.

Co-Authored-By: Claude Opus 4.8 <noreply@anthropic.com>
Claude-Session: https://claude.ai/code/session_01MPAxuqCqMDFFvD4hFtwauN
</commit_message>
<xml_diff>
--- a/proposal/contract.docx
+++ b/proposal/contract.docx
@@ -226,7 +226,7 @@
           <w:sz w:val="22"/>
           <w:szCs w:val="22"/>
         </w:rPr>
-        <w:t xml:space="preserve">طراحی و اجرای پروژهٔ شفاف‌سازی و یکپارچه‌سازی سیستم اطلاعاتی کارفرما میان سه سامانهٔ عملیات، انبار و حسابداری، مشتمل بر چهار فاز به شرح مادهٔ ۴، مطابق پروپوزال مورد تأیید کارفرما که به‌عنوان «پیوست شمارهٔ ۱» جزء لاینفک این قرارداد است.</w:t>
+        <w:t xml:space="preserve">طراحی و اجرای پروژهٔ شفاف‌سازی و یکپارچه‌سازی سیستم اطلاعاتی کارفرما میان سه سامانهٔ عملیات، انبار و حسابداری، مشتمل بر چهار فاز که شرح فعالیت‌ها، خروجی‌ها و نتایج قابل‌تحویلِ هر فاز به‌تفصیل در مادهٔ ۴ این قرارداد آمده است.</w:t>
       </w:r>
     </w:p>
     <w:p>
@@ -1141,7 +1141,7 @@
     </w:tbl>
     <w:p>
       <w:pPr>
-        <w:spacing w:after="40"/>
+        <w:spacing w:after="60"/>
       </w:pPr>
       <w:r>
         <w:t xml:space="preserve"/>
@@ -1158,11 +1158,825 @@
           <w:rFonts w:ascii="Tahoma" w:cs="Tahoma" w:eastAsia="Tahoma" w:hAnsi="Tahoma"/>
           <w:b w:val="false"/>
           <w:bCs w:val="false"/>
-          <w:color w:val="5A6B75"/>
+          <w:color w:val="1A1A1A"/>
+          <w:sz w:val="22"/>
+          <w:szCs w:val="22"/>
+        </w:rPr>
+        <w:t xml:space="preserve">شرح تفصیلی فعالیت‌ها، خروجی‌ها و نتایج قابل‌تحویلِ هر فاز به‌شرح زیر است. تحقق «خروجی‌ها و نتایج قابل‌تحویل» هر فاز، شرط تحویل و تأیید آن فاز موضوع مادهٔ ۶ است:</w:t>
+      </w:r>
+    </w:p>
+    <w:p>
+      <w:pPr>
+        <w:bidi/>
+        <w:spacing w:after="40" w:before="120" w:line="300"/>
+        <w:jc w:val="both"/>
+      </w:pPr>
+      <w:r>
+        <w:rPr>
+          <w:rFonts w:ascii="Tahoma" w:cs="Tahoma" w:eastAsia="Tahoma" w:hAnsi="Tahoma"/>
+          <w:b/>
+          <w:bCs/>
+          <w:color w:val="0B2E4F"/>
+          <w:sz w:val="22"/>
+          <w:szCs w:val="22"/>
+        </w:rPr>
+        <w:t xml:space="preserve">۴-۱) فاز اول — رمزگشایی دیتابیس سه نرم‌افزار (۱۰ روز)</w:t>
+      </w:r>
+    </w:p>
+    <w:p>
+      <w:pPr>
+        <w:bidi/>
+        <w:spacing w:after="30" w:before="0" w:line="300"/>
+        <w:jc w:val="both"/>
+      </w:pPr>
+      <w:r>
+        <w:rPr>
+          <w:rFonts w:ascii="Tahoma" w:cs="Tahoma" w:eastAsia="Tahoma" w:hAnsi="Tahoma"/>
+          <w:b/>
+          <w:bCs/>
+          <w:color w:val="0E7C86"/>
           <w:sz w:val="20"/>
           <w:szCs w:val="20"/>
         </w:rPr>
-        <w:t xml:space="preserve">شرح تفصیلی فعالیت‌ها و خروجی هر فاز مطابق پیوست شمارهٔ ۱ است.</w:t>
+        <w:t xml:space="preserve">فعالیت‌ها:</w:t>
+      </w:r>
+    </w:p>
+    <w:p>
+      <w:pPr>
+        <w:pStyle w:val="ListParagraph"/>
+        <w:numPr>
+          <w:ilvl w:val="0"/>
+          <w:numId w:val="2"/>
+        </w:numPr>
+        <w:bidi/>
+        <w:spacing w:after="70" w:line="290"/>
+        <w:jc w:val="both"/>
+      </w:pPr>
+      <w:r>
+        <w:rPr>
+          <w:rFonts w:ascii="Tahoma" w:cs="Tahoma" w:eastAsia="Tahoma" w:hAnsi="Tahoma"/>
+          <w:b w:val="false"/>
+          <w:bCs w:val="false"/>
+          <w:color w:val="1A1A1A"/>
+          <w:sz w:val="21"/>
+          <w:szCs w:val="21"/>
+        </w:rPr>
+        <w:t xml:space="preserve">مهندسی معکوس و رمزگشایی ساختار دیتابیس هر سه نرم‌افزار (عملیات، انبار، حسابداری): جداول، روابط و فیلدها.</w:t>
+      </w:r>
+    </w:p>
+    <w:p>
+      <w:pPr>
+        <w:pStyle w:val="ListParagraph"/>
+        <w:numPr>
+          <w:ilvl w:val="0"/>
+          <w:numId w:val="2"/>
+        </w:numPr>
+        <w:bidi/>
+        <w:spacing w:after="70" w:line="290"/>
+        <w:jc w:val="both"/>
+      </w:pPr>
+      <w:r>
+        <w:rPr>
+          <w:rFonts w:ascii="Tahoma" w:cs="Tahoma" w:eastAsia="Tahoma" w:hAnsi="Tahoma"/>
+          <w:b w:val="false"/>
+          <w:bCs w:val="false"/>
+          <w:color w:val="1A1A1A"/>
+          <w:sz w:val="21"/>
+          <w:szCs w:val="21"/>
+        </w:rPr>
+        <w:t xml:space="preserve">شناسایی محل ذخیرهٔ دستور کار، اقلام مصرفی، صورت‌حساب، اسناد مالی و موجودی.</w:t>
+      </w:r>
+    </w:p>
+    <w:p>
+      <w:pPr>
+        <w:pStyle w:val="ListParagraph"/>
+        <w:numPr>
+          <w:ilvl w:val="0"/>
+          <w:numId w:val="2"/>
+        </w:numPr>
+        <w:bidi/>
+        <w:spacing w:after="70" w:line="290"/>
+        <w:jc w:val="both"/>
+      </w:pPr>
+      <w:r>
+        <w:rPr>
+          <w:rFonts w:ascii="Tahoma" w:cs="Tahoma" w:eastAsia="Tahoma" w:hAnsi="Tahoma"/>
+          <w:b w:val="false"/>
+          <w:bCs w:val="false"/>
+          <w:color w:val="1A1A1A"/>
+          <w:sz w:val="21"/>
+          <w:szCs w:val="21"/>
+        </w:rPr>
+        <w:t xml:space="preserve">باز کردن داده‌های رمزنگاری‌شده/کدشده و برقراری دسترسی امن و پایدار به داده‌ها.</w:t>
+      </w:r>
+    </w:p>
+    <w:p>
+      <w:pPr>
+        <w:bidi/>
+        <w:spacing w:after="30" w:before="0" w:line="300"/>
+        <w:jc w:val="both"/>
+      </w:pPr>
+      <w:r>
+        <w:rPr>
+          <w:rFonts w:ascii="Tahoma" w:cs="Tahoma" w:eastAsia="Tahoma" w:hAnsi="Tahoma"/>
+          <w:b/>
+          <w:bCs/>
+          <w:color w:val="0E7C86"/>
+          <w:sz w:val="20"/>
+          <w:szCs w:val="20"/>
+        </w:rPr>
+        <w:t xml:space="preserve">خروجی‌ها و نتایج قابل‌تحویل:</w:t>
+      </w:r>
+    </w:p>
+    <w:p>
+      <w:pPr>
+        <w:pStyle w:val="ListParagraph"/>
+        <w:numPr>
+          <w:ilvl w:val="0"/>
+          <w:numId w:val="2"/>
+        </w:numPr>
+        <w:bidi/>
+        <w:spacing w:after="70" w:line="290"/>
+        <w:jc w:val="both"/>
+      </w:pPr>
+      <w:r>
+        <w:rPr>
+          <w:rFonts w:ascii="Tahoma" w:cs="Tahoma" w:eastAsia="Tahoma" w:hAnsi="Tahoma"/>
+          <w:b w:val="false"/>
+          <w:bCs w:val="false"/>
+          <w:color w:val="1A1A1A"/>
+          <w:sz w:val="21"/>
+          <w:szCs w:val="21"/>
+        </w:rPr>
+        <w:t xml:space="preserve">نقشهٔ کامل ساختار دیتابیس هر سه نرم‌افزار.</w:t>
+      </w:r>
+    </w:p>
+    <w:p>
+      <w:pPr>
+        <w:pStyle w:val="ListParagraph"/>
+        <w:numPr>
+          <w:ilvl w:val="0"/>
+          <w:numId w:val="2"/>
+        </w:numPr>
+        <w:bidi/>
+        <w:spacing w:after="70" w:line="290"/>
+        <w:jc w:val="both"/>
+      </w:pPr>
+      <w:r>
+        <w:rPr>
+          <w:rFonts w:ascii="Tahoma" w:cs="Tahoma" w:eastAsia="Tahoma" w:hAnsi="Tahoma"/>
+          <w:b w:val="false"/>
+          <w:bCs w:val="false"/>
+          <w:color w:val="1A1A1A"/>
+          <w:sz w:val="21"/>
+          <w:szCs w:val="21"/>
+        </w:rPr>
+        <w:t xml:space="preserve">دیکشنری داده (Data Dictionary) شامل تعریف جداول و فیلدهای کلیدی.</w:t>
+      </w:r>
+    </w:p>
+    <w:p>
+      <w:pPr>
+        <w:pStyle w:val="ListParagraph"/>
+        <w:numPr>
+          <w:ilvl w:val="0"/>
+          <w:numId w:val="2"/>
+        </w:numPr>
+        <w:bidi/>
+        <w:spacing w:after="70" w:line="290"/>
+        <w:jc w:val="both"/>
+      </w:pPr>
+      <w:r>
+        <w:rPr>
+          <w:rFonts w:ascii="Tahoma" w:cs="Tahoma" w:eastAsia="Tahoma" w:hAnsi="Tahoma"/>
+          <w:b w:val="false"/>
+          <w:bCs w:val="false"/>
+          <w:color w:val="1A1A1A"/>
+          <w:sz w:val="21"/>
+          <w:szCs w:val="21"/>
+        </w:rPr>
+        <w:t xml:space="preserve">روش مستند و امنِ دسترسی به داده‌ها، به‌عنوان پیش‌نیاز فاز دوم.</w:t>
+      </w:r>
+    </w:p>
+    <w:p>
+      <w:pPr>
+        <w:bidi/>
+        <w:spacing w:after="40" w:before="120" w:line="300"/>
+        <w:jc w:val="both"/>
+      </w:pPr>
+      <w:r>
+        <w:rPr>
+          <w:rFonts w:ascii="Tahoma" w:cs="Tahoma" w:eastAsia="Tahoma" w:hAnsi="Tahoma"/>
+          <w:b/>
+          <w:bCs/>
+          <w:color w:val="0B2E4F"/>
+          <w:sz w:val="22"/>
+          <w:szCs w:val="22"/>
+        </w:rPr>
+        <w:t xml:space="preserve">۴-۲) فاز دوم — ساخت انبار داده (۱۰ روز)</w:t>
+      </w:r>
+    </w:p>
+    <w:p>
+      <w:pPr>
+        <w:bidi/>
+        <w:spacing w:after="30" w:before="0" w:line="300"/>
+        <w:jc w:val="both"/>
+      </w:pPr>
+      <w:r>
+        <w:rPr>
+          <w:rFonts w:ascii="Tahoma" w:cs="Tahoma" w:eastAsia="Tahoma" w:hAnsi="Tahoma"/>
+          <w:b/>
+          <w:bCs/>
+          <w:color w:val="0E7C86"/>
+          <w:sz w:val="20"/>
+          <w:szCs w:val="20"/>
+        </w:rPr>
+        <w:t xml:space="preserve">فعالیت‌ها:</w:t>
+      </w:r>
+    </w:p>
+    <w:p>
+      <w:pPr>
+        <w:pStyle w:val="ListParagraph"/>
+        <w:numPr>
+          <w:ilvl w:val="0"/>
+          <w:numId w:val="2"/>
+        </w:numPr>
+        <w:bidi/>
+        <w:spacing w:after="70" w:line="290"/>
+        <w:jc w:val="both"/>
+      </w:pPr>
+      <w:r>
+        <w:rPr>
+          <w:rFonts w:ascii="Tahoma" w:cs="Tahoma" w:eastAsia="Tahoma" w:hAnsi="Tahoma"/>
+          <w:b w:val="false"/>
+          <w:bCs w:val="false"/>
+          <w:color w:val="1A1A1A"/>
+          <w:sz w:val="21"/>
+          <w:szCs w:val="21"/>
+        </w:rPr>
+        <w:t xml:space="preserve">شناسایی و مستندسازی منابع داده در همهٔ شعب.</w:t>
+      </w:r>
+    </w:p>
+    <w:p>
+      <w:pPr>
+        <w:pStyle w:val="ListParagraph"/>
+        <w:numPr>
+          <w:ilvl w:val="0"/>
+          <w:numId w:val="2"/>
+        </w:numPr>
+        <w:bidi/>
+        <w:spacing w:after="70" w:line="290"/>
+        <w:jc w:val="both"/>
+      </w:pPr>
+      <w:r>
+        <w:rPr>
+          <w:rFonts w:ascii="Tahoma" w:cs="Tahoma" w:eastAsia="Tahoma" w:hAnsi="Tahoma"/>
+          <w:b w:val="false"/>
+          <w:bCs w:val="false"/>
+          <w:color w:val="1A1A1A"/>
+          <w:sz w:val="21"/>
+          <w:szCs w:val="21"/>
+        </w:rPr>
+        <w:t xml:space="preserve">پیاده‌سازی فرآیند استخراج، تبدیل و بارگذاری داده (ETL) از سه سامانه.</w:t>
+      </w:r>
+    </w:p>
+    <w:p>
+      <w:pPr>
+        <w:pStyle w:val="ListParagraph"/>
+        <w:numPr>
+          <w:ilvl w:val="0"/>
+          <w:numId w:val="2"/>
+        </w:numPr>
+        <w:bidi/>
+        <w:spacing w:after="70" w:line="290"/>
+        <w:jc w:val="both"/>
+      </w:pPr>
+      <w:r>
+        <w:rPr>
+          <w:rFonts w:ascii="Tahoma" w:cs="Tahoma" w:eastAsia="Tahoma" w:hAnsi="Tahoma"/>
+          <w:b w:val="false"/>
+          <w:bCs w:val="false"/>
+          <w:color w:val="1A1A1A"/>
+          <w:sz w:val="21"/>
+          <w:szCs w:val="21"/>
+        </w:rPr>
+        <w:t xml:space="preserve">پاک‌سازی، استانداردسازی و یکدست‌سازی داده‌ها (تاریخ، کد کالا، کد شعبه، مشتری).</w:t>
+      </w:r>
+    </w:p>
+    <w:p>
+      <w:pPr>
+        <w:bidi/>
+        <w:spacing w:after="30" w:before="0" w:line="300"/>
+        <w:jc w:val="both"/>
+      </w:pPr>
+      <w:r>
+        <w:rPr>
+          <w:rFonts w:ascii="Tahoma" w:cs="Tahoma" w:eastAsia="Tahoma" w:hAnsi="Tahoma"/>
+          <w:b/>
+          <w:bCs/>
+          <w:color w:val="0E7C86"/>
+          <w:sz w:val="20"/>
+          <w:szCs w:val="20"/>
+        </w:rPr>
+        <w:t xml:space="preserve">خروجی‌ها و نتایج قابل‌تحویل:</w:t>
+      </w:r>
+    </w:p>
+    <w:p>
+      <w:pPr>
+        <w:pStyle w:val="ListParagraph"/>
+        <w:numPr>
+          <w:ilvl w:val="0"/>
+          <w:numId w:val="2"/>
+        </w:numPr>
+        <w:bidi/>
+        <w:spacing w:after="70" w:line="290"/>
+        <w:jc w:val="both"/>
+      </w:pPr>
+      <w:r>
+        <w:rPr>
+          <w:rFonts w:ascii="Tahoma" w:cs="Tahoma" w:eastAsia="Tahoma" w:hAnsi="Tahoma"/>
+          <w:b w:val="false"/>
+          <w:bCs w:val="false"/>
+          <w:color w:val="1A1A1A"/>
+          <w:sz w:val="21"/>
+          <w:szCs w:val="21"/>
+        </w:rPr>
+        <w:t xml:space="preserve">انبار دادهٔ مرکزی و یکپارچه از هر سه سامانه و همهٔ شعب (منبع واحد حقیقت).</w:t>
+      </w:r>
+    </w:p>
+    <w:p>
+      <w:pPr>
+        <w:pStyle w:val="ListParagraph"/>
+        <w:numPr>
+          <w:ilvl w:val="0"/>
+          <w:numId w:val="2"/>
+        </w:numPr>
+        <w:bidi/>
+        <w:spacing w:after="70" w:line="290"/>
+        <w:jc w:val="both"/>
+      </w:pPr>
+      <w:r>
+        <w:rPr>
+          <w:rFonts w:ascii="Tahoma" w:cs="Tahoma" w:eastAsia="Tahoma" w:hAnsi="Tahoma"/>
+          <w:b w:val="false"/>
+          <w:bCs w:val="false"/>
+          <w:color w:val="1A1A1A"/>
+          <w:sz w:val="21"/>
+          <w:szCs w:val="21"/>
+        </w:rPr>
+        <w:t xml:space="preserve">مستندات مدل داده و فرآیند ETL.</w:t>
+      </w:r>
+    </w:p>
+    <w:p>
+      <w:pPr>
+        <w:pStyle w:val="ListParagraph"/>
+        <w:numPr>
+          <w:ilvl w:val="0"/>
+          <w:numId w:val="2"/>
+        </w:numPr>
+        <w:bidi/>
+        <w:spacing w:after="70" w:line="290"/>
+        <w:jc w:val="both"/>
+      </w:pPr>
+      <w:r>
+        <w:rPr>
+          <w:rFonts w:ascii="Tahoma" w:cs="Tahoma" w:eastAsia="Tahoma" w:hAnsi="Tahoma"/>
+          <w:b w:val="false"/>
+          <w:bCs w:val="false"/>
+          <w:color w:val="1A1A1A"/>
+          <w:sz w:val="21"/>
+          <w:szCs w:val="21"/>
+        </w:rPr>
+        <w:t xml:space="preserve">فرآیند تکرارپذیرِ بارگذاری و به‌روزرسانی داده.</w:t>
+      </w:r>
+    </w:p>
+    <w:p>
+      <w:pPr>
+        <w:bidi/>
+        <w:spacing w:after="40" w:before="120" w:line="300"/>
+        <w:jc w:val="both"/>
+      </w:pPr>
+      <w:r>
+        <w:rPr>
+          <w:rFonts w:ascii="Tahoma" w:cs="Tahoma" w:eastAsia="Tahoma" w:hAnsi="Tahoma"/>
+          <w:b/>
+          <w:bCs/>
+          <w:color w:val="0B2E4F"/>
+          <w:sz w:val="22"/>
+          <w:szCs w:val="22"/>
+        </w:rPr>
+        <w:t xml:space="preserve">۴-۳) فاز سوم — مایگریشن و متناظرسازی (۲۰ روز)</w:t>
+      </w:r>
+    </w:p>
+    <w:p>
+      <w:pPr>
+        <w:bidi/>
+        <w:spacing w:after="30" w:before="0" w:line="300"/>
+        <w:jc w:val="both"/>
+      </w:pPr>
+      <w:r>
+        <w:rPr>
+          <w:rFonts w:ascii="Tahoma" w:cs="Tahoma" w:eastAsia="Tahoma" w:hAnsi="Tahoma"/>
+          <w:b/>
+          <w:bCs/>
+          <w:color w:val="0E7C86"/>
+          <w:sz w:val="20"/>
+          <w:szCs w:val="20"/>
+        </w:rPr>
+        <w:t xml:space="preserve">فعالیت‌ها:</w:t>
+      </w:r>
+    </w:p>
+    <w:p>
+      <w:pPr>
+        <w:pStyle w:val="ListParagraph"/>
+        <w:numPr>
+          <w:ilvl w:val="0"/>
+          <w:numId w:val="2"/>
+        </w:numPr>
+        <w:bidi/>
+        <w:spacing w:after="70" w:line="290"/>
+        <w:jc w:val="both"/>
+      </w:pPr>
+      <w:r>
+        <w:rPr>
+          <w:rFonts w:ascii="Tahoma" w:cs="Tahoma" w:eastAsia="Tahoma" w:hAnsi="Tahoma"/>
+          <w:b w:val="false"/>
+          <w:bCs w:val="false"/>
+          <w:color w:val="1A1A1A"/>
+          <w:sz w:val="21"/>
+          <w:szCs w:val="21"/>
+        </w:rPr>
+        <w:t xml:space="preserve">تعریف کلید مشترک و قواعد متناظرسازی بین دستور کار، انبار و حسابداری.</w:t>
+      </w:r>
+    </w:p>
+    <w:p>
+      <w:pPr>
+        <w:pStyle w:val="ListParagraph"/>
+        <w:numPr>
+          <w:ilvl w:val="0"/>
+          <w:numId w:val="2"/>
+        </w:numPr>
+        <w:bidi/>
+        <w:spacing w:after="70" w:line="290"/>
+        <w:jc w:val="both"/>
+      </w:pPr>
+      <w:r>
+        <w:rPr>
+          <w:rFonts w:ascii="Tahoma" w:cs="Tahoma" w:eastAsia="Tahoma" w:hAnsi="Tahoma"/>
+          <w:b w:val="false"/>
+          <w:bCs w:val="false"/>
+          <w:color w:val="1A1A1A"/>
+          <w:sz w:val="21"/>
+          <w:szCs w:val="21"/>
+        </w:rPr>
+        <w:t xml:space="preserve">پیاده‌سازی موتور مغایرت‌گیری سه‌محوره: اقلام مصرفی ⇄ انبار، صورت‌حساب/درآمد ⇄ حسابداری، هزینه و تنخواه ⇄ حسابداری.</w:t>
+      </w:r>
+    </w:p>
+    <w:p>
+      <w:pPr>
+        <w:pStyle w:val="ListParagraph"/>
+        <w:numPr>
+          <w:ilvl w:val="0"/>
+          <w:numId w:val="2"/>
+        </w:numPr>
+        <w:bidi/>
+        <w:spacing w:after="70" w:line="290"/>
+        <w:jc w:val="both"/>
+      </w:pPr>
+      <w:r>
+        <w:rPr>
+          <w:rFonts w:ascii="Tahoma" w:cs="Tahoma" w:eastAsia="Tahoma" w:hAnsi="Tahoma"/>
+          <w:b w:val="false"/>
+          <w:bCs w:val="false"/>
+          <w:color w:val="1A1A1A"/>
+          <w:sz w:val="21"/>
+          <w:szCs w:val="21"/>
+        </w:rPr>
+        <w:t xml:space="preserve">مایگریشن و تطبیق دادهٔ تاریخی و اعتبارسنجی نتایج با نمونه‌گیری.</w:t>
+      </w:r>
+    </w:p>
+    <w:p>
+      <w:pPr>
+        <w:bidi/>
+        <w:spacing w:after="30" w:before="0" w:line="300"/>
+        <w:jc w:val="both"/>
+      </w:pPr>
+      <w:r>
+        <w:rPr>
+          <w:rFonts w:ascii="Tahoma" w:cs="Tahoma" w:eastAsia="Tahoma" w:hAnsi="Tahoma"/>
+          <w:b/>
+          <w:bCs/>
+          <w:color w:val="0E7C86"/>
+          <w:sz w:val="20"/>
+          <w:szCs w:val="20"/>
+        </w:rPr>
+        <w:t xml:space="preserve">خروجی‌ها و نتایج قابل‌تحویل:</w:t>
+      </w:r>
+    </w:p>
+    <w:p>
+      <w:pPr>
+        <w:pStyle w:val="ListParagraph"/>
+        <w:numPr>
+          <w:ilvl w:val="0"/>
+          <w:numId w:val="2"/>
+        </w:numPr>
+        <w:bidi/>
+        <w:spacing w:after="70" w:line="290"/>
+        <w:jc w:val="both"/>
+      </w:pPr>
+      <w:r>
+        <w:rPr>
+          <w:rFonts w:ascii="Tahoma" w:cs="Tahoma" w:eastAsia="Tahoma" w:hAnsi="Tahoma"/>
+          <w:b w:val="false"/>
+          <w:bCs w:val="false"/>
+          <w:color w:val="1A1A1A"/>
+          <w:sz w:val="21"/>
+          <w:szCs w:val="21"/>
+        </w:rPr>
+        <w:t xml:space="preserve">گزارش مغایرت‌گیری خودکار که دقیقاً محل عدم‌تطابق انبار با عملیات و حسابداری را نشان می‌دهد.</w:t>
+      </w:r>
+    </w:p>
+    <w:p>
+      <w:pPr>
+        <w:pStyle w:val="ListParagraph"/>
+        <w:numPr>
+          <w:ilvl w:val="0"/>
+          <w:numId w:val="2"/>
+        </w:numPr>
+        <w:bidi/>
+        <w:spacing w:after="70" w:line="290"/>
+        <w:jc w:val="both"/>
+      </w:pPr>
+      <w:r>
+        <w:rPr>
+          <w:rFonts w:ascii="Tahoma" w:cs="Tahoma" w:eastAsia="Tahoma" w:hAnsi="Tahoma"/>
+          <w:b w:val="false"/>
+          <w:bCs w:val="false"/>
+          <w:color w:val="1A1A1A"/>
+          <w:sz w:val="21"/>
+          <w:szCs w:val="21"/>
+        </w:rPr>
+        <w:t xml:space="preserve">دسته‌بندی مغایرت‌ها: قلم کسرنشده، سند مالی مفقود، درآمد بی‌انتساب و مغایرت تنخواه.</w:t>
+      </w:r>
+    </w:p>
+    <w:p>
+      <w:pPr>
+        <w:pStyle w:val="ListParagraph"/>
+        <w:numPr>
+          <w:ilvl w:val="0"/>
+          <w:numId w:val="2"/>
+        </w:numPr>
+        <w:bidi/>
+        <w:spacing w:after="70" w:line="290"/>
+        <w:jc w:val="both"/>
+      </w:pPr>
+      <w:r>
+        <w:rPr>
+          <w:rFonts w:ascii="Tahoma" w:cs="Tahoma" w:eastAsia="Tahoma" w:hAnsi="Tahoma"/>
+          <w:b w:val="false"/>
+          <w:bCs w:val="false"/>
+          <w:color w:val="1A1A1A"/>
+          <w:sz w:val="21"/>
+          <w:szCs w:val="21"/>
+        </w:rPr>
+        <w:t xml:space="preserve">دادهٔ تاریخیِ متناظرشده و اعتبارسنجی‌شده.</w:t>
+      </w:r>
+    </w:p>
+    <w:p>
+      <w:pPr>
+        <w:bidi/>
+        <w:spacing w:after="40" w:before="120" w:line="300"/>
+        <w:jc w:val="both"/>
+      </w:pPr>
+      <w:r>
+        <w:rPr>
+          <w:rFonts w:ascii="Tahoma" w:cs="Tahoma" w:eastAsia="Tahoma" w:hAnsi="Tahoma"/>
+          <w:b/>
+          <w:bCs/>
+          <w:color w:val="0B2E4F"/>
+          <w:sz w:val="22"/>
+          <w:szCs w:val="22"/>
+        </w:rPr>
+        <w:t xml:space="preserve">۴-۴) فاز چهارم — پلتفرم BI و داشبوردها (۱۵ روز)</w:t>
+      </w:r>
+    </w:p>
+    <w:p>
+      <w:pPr>
+        <w:bidi/>
+        <w:spacing w:after="30" w:before="0" w:line="300"/>
+        <w:jc w:val="both"/>
+      </w:pPr>
+      <w:r>
+        <w:rPr>
+          <w:rFonts w:ascii="Tahoma" w:cs="Tahoma" w:eastAsia="Tahoma" w:hAnsi="Tahoma"/>
+          <w:b/>
+          <w:bCs/>
+          <w:color w:val="0E7C86"/>
+          <w:sz w:val="20"/>
+          <w:szCs w:val="20"/>
+        </w:rPr>
+        <w:t xml:space="preserve">فعالیت‌ها:</w:t>
+      </w:r>
+    </w:p>
+    <w:p>
+      <w:pPr>
+        <w:pStyle w:val="ListParagraph"/>
+        <w:numPr>
+          <w:ilvl w:val="0"/>
+          <w:numId w:val="2"/>
+        </w:numPr>
+        <w:bidi/>
+        <w:spacing w:after="70" w:line="290"/>
+        <w:jc w:val="both"/>
+      </w:pPr>
+      <w:r>
+        <w:rPr>
+          <w:rFonts w:ascii="Tahoma" w:cs="Tahoma" w:eastAsia="Tahoma" w:hAnsi="Tahoma"/>
+          <w:b w:val="false"/>
+          <w:bCs w:val="false"/>
+          <w:color w:val="1A1A1A"/>
+          <w:sz w:val="21"/>
+          <w:szCs w:val="21"/>
+        </w:rPr>
+        <w:t xml:space="preserve">راه‌اندازی پلتفرم هوش تجاری (BI) و اتصال آن به انبار داده.</w:t>
+      </w:r>
+    </w:p>
+    <w:p>
+      <w:pPr>
+        <w:pStyle w:val="ListParagraph"/>
+        <w:numPr>
+          <w:ilvl w:val="0"/>
+          <w:numId w:val="2"/>
+        </w:numPr>
+        <w:bidi/>
+        <w:spacing w:after="70" w:line="290"/>
+        <w:jc w:val="both"/>
+      </w:pPr>
+      <w:r>
+        <w:rPr>
+          <w:rFonts w:ascii="Tahoma" w:cs="Tahoma" w:eastAsia="Tahoma" w:hAnsi="Tahoma"/>
+          <w:b w:val="false"/>
+          <w:bCs w:val="false"/>
+          <w:color w:val="1A1A1A"/>
+          <w:sz w:val="21"/>
+          <w:szCs w:val="21"/>
+        </w:rPr>
+        <w:t xml:space="preserve">طراحی و پیاده‌سازی داشبوردها با قابلیت drill-down و فیلترگذاری آزاد.</w:t>
+      </w:r>
+    </w:p>
+    <w:p>
+      <w:pPr>
+        <w:pStyle w:val="ListParagraph"/>
+        <w:numPr>
+          <w:ilvl w:val="0"/>
+          <w:numId w:val="2"/>
+        </w:numPr>
+        <w:bidi/>
+        <w:spacing w:after="70" w:line="290"/>
+        <w:jc w:val="both"/>
+      </w:pPr>
+      <w:r>
+        <w:rPr>
+          <w:rFonts w:ascii="Tahoma" w:cs="Tahoma" w:eastAsia="Tahoma" w:hAnsi="Tahoma"/>
+          <w:b w:val="false"/>
+          <w:bCs w:val="false"/>
+          <w:color w:val="1A1A1A"/>
+          <w:sz w:val="21"/>
+          <w:szCs w:val="21"/>
+        </w:rPr>
+        <w:t xml:space="preserve">آموزش کاربران و تحویل مستندات بهره‌برداری.</w:t>
+      </w:r>
+    </w:p>
+    <w:p>
+      <w:pPr>
+        <w:bidi/>
+        <w:spacing w:after="30" w:before="0" w:line="300"/>
+        <w:jc w:val="both"/>
+      </w:pPr>
+      <w:r>
+        <w:rPr>
+          <w:rFonts w:ascii="Tahoma" w:cs="Tahoma" w:eastAsia="Tahoma" w:hAnsi="Tahoma"/>
+          <w:b/>
+          <w:bCs/>
+          <w:color w:val="0E7C86"/>
+          <w:sz w:val="20"/>
+          <w:szCs w:val="20"/>
+        </w:rPr>
+        <w:t xml:space="preserve">خروجی‌ها و نتایج قابل‌تحویل:</w:t>
+      </w:r>
+    </w:p>
+    <w:p>
+      <w:pPr>
+        <w:pStyle w:val="ListParagraph"/>
+        <w:numPr>
+          <w:ilvl w:val="0"/>
+          <w:numId w:val="2"/>
+        </w:numPr>
+        <w:bidi/>
+        <w:spacing w:after="70" w:line="290"/>
+        <w:jc w:val="both"/>
+      </w:pPr>
+      <w:r>
+        <w:rPr>
+          <w:rFonts w:ascii="Tahoma" w:cs="Tahoma" w:eastAsia="Tahoma" w:hAnsi="Tahoma"/>
+          <w:b w:val="false"/>
+          <w:bCs w:val="false"/>
+          <w:color w:val="1A1A1A"/>
+          <w:sz w:val="21"/>
+          <w:szCs w:val="21"/>
+        </w:rPr>
+        <w:t xml:space="preserve">داشبورد عملیاتی: حجم عملیات و عملکرد شعب.</w:t>
+      </w:r>
+    </w:p>
+    <w:p>
+      <w:pPr>
+        <w:pStyle w:val="ListParagraph"/>
+        <w:numPr>
+          <w:ilvl w:val="0"/>
+          <w:numId w:val="2"/>
+        </w:numPr>
+        <w:bidi/>
+        <w:spacing w:after="70" w:line="290"/>
+        <w:jc w:val="both"/>
+      </w:pPr>
+      <w:r>
+        <w:rPr>
+          <w:rFonts w:ascii="Tahoma" w:cs="Tahoma" w:eastAsia="Tahoma" w:hAnsi="Tahoma"/>
+          <w:b w:val="false"/>
+          <w:bCs w:val="false"/>
+          <w:color w:val="1A1A1A"/>
+          <w:sz w:val="21"/>
+          <w:szCs w:val="21"/>
+        </w:rPr>
+        <w:t xml:space="preserve">داشبورد انبار: موجودی، گردش کالا و مغایرت موجودی.</w:t>
+      </w:r>
+    </w:p>
+    <w:p>
+      <w:pPr>
+        <w:pStyle w:val="ListParagraph"/>
+        <w:numPr>
+          <w:ilvl w:val="0"/>
+          <w:numId w:val="2"/>
+        </w:numPr>
+        <w:bidi/>
+        <w:spacing w:after="70" w:line="290"/>
+        <w:jc w:val="both"/>
+      </w:pPr>
+      <w:r>
+        <w:rPr>
+          <w:rFonts w:ascii="Tahoma" w:cs="Tahoma" w:eastAsia="Tahoma" w:hAnsi="Tahoma"/>
+          <w:b w:val="false"/>
+          <w:bCs w:val="false"/>
+          <w:color w:val="1A1A1A"/>
+          <w:sz w:val="21"/>
+          <w:szCs w:val="21"/>
+        </w:rPr>
+        <w:t xml:space="preserve">داشبورد مالی: درآمد، بهای تمام‌شده و سود/زیان.</w:t>
+      </w:r>
+    </w:p>
+    <w:p>
+      <w:pPr>
+        <w:pStyle w:val="ListParagraph"/>
+        <w:numPr>
+          <w:ilvl w:val="0"/>
+          <w:numId w:val="2"/>
+        </w:numPr>
+        <w:bidi/>
+        <w:spacing w:after="70" w:line="290"/>
+        <w:jc w:val="both"/>
+      </w:pPr>
+      <w:r>
+        <w:rPr>
+          <w:rFonts w:ascii="Tahoma" w:cs="Tahoma" w:eastAsia="Tahoma" w:hAnsi="Tahoma"/>
+          <w:b w:val="false"/>
+          <w:bCs w:val="false"/>
+          <w:color w:val="1A1A1A"/>
+          <w:sz w:val="21"/>
+          <w:szCs w:val="21"/>
+        </w:rPr>
+        <w:t xml:space="preserve">داشبورد مغایرت‌گیری: پایش لحظه‌ای هم‌خوانی سه سامانه.</w:t>
+      </w:r>
+    </w:p>
+    <w:p>
+      <w:pPr>
+        <w:pStyle w:val="ListParagraph"/>
+        <w:numPr>
+          <w:ilvl w:val="0"/>
+          <w:numId w:val="2"/>
+        </w:numPr>
+        <w:bidi/>
+        <w:spacing w:after="70" w:line="290"/>
+        <w:jc w:val="both"/>
+      </w:pPr>
+      <w:r>
+        <w:rPr>
+          <w:rFonts w:ascii="Tahoma" w:cs="Tahoma" w:eastAsia="Tahoma" w:hAnsi="Tahoma"/>
+          <w:b w:val="false"/>
+          <w:bCs w:val="false"/>
+          <w:color w:val="1A1A1A"/>
+          <w:sz w:val="21"/>
+          <w:szCs w:val="21"/>
+        </w:rPr>
+        <w:t xml:space="preserve">قابلیت drill-down تا سطح تراکنش، به‌همراه مستندات و آموزش کاربران.</w:t>
       </w:r>
     </w:p>
     <w:p>
@@ -2418,7 +3232,7 @@
           <w:sz w:val="21"/>
           <w:szCs w:val="21"/>
         </w:rPr>
-        <w:t xml:space="preserve">اجرای کامل موضوع قرارداد مطابق فازها، خروجی‌ها و کیفیت مندرج در پیوست شمارهٔ ۱.</w:t>
+        <w:t xml:space="preserve">اجرای کامل موضوع قرارداد مطابق فازها، خروجی‌ها و نتایج قابل‌تحویلِ مندرج در مادهٔ ۴ این قرارداد.</w:t>
       </w:r>
     </w:p>
     <w:p>
@@ -3317,7 +4131,7 @@
           <w:sz w:val="26"/>
           <w:szCs w:val="26"/>
         </w:rPr>
-        <w:t xml:space="preserve">مادهٔ ۱۷ — نسخ و پیوست‌های قرارداد</w:t>
+        <w:t xml:space="preserve">مادهٔ ۱۷ — نسخ قرارداد</w:t>
       </w:r>
     </w:p>
     <w:p>
@@ -3335,7 +4149,7 @@
           <w:sz w:val="22"/>
           <w:szCs w:val="22"/>
         </w:rPr>
-        <w:t xml:space="preserve">این قرارداد در ۱۷ ماده و ۱ پیوست (پروپوزال مورد تأیید) و در ۲ نسخهٔ متحدالمتن و دارای اعتبار یکسان تنظیم و پس از امضا و مبادله، برای طرفین لازم‌الاجرا است.</w:t>
+        <w:t xml:space="preserve">این قرارداد در ۱۷ ماده و بدون پیوست، در ۲ نسخهٔ متحدالمتن و دارای اعتبار یکسان تنظیم و پس از امضا و مبادله، برای طرفین لازم‌الاجرا است.</w:t>
       </w:r>
     </w:p>
     <w:p>

</xml_diff>